<commit_message>
Reschedule DCA-TRANCHE-2/4 off a holiday and a weekend
DCA-TRANCHE-2 was dated 9/7/2026 (Labor Day, market closed) and
DCA-TRANCHE-4 was dated 11/7/2026 (a Saturday) -- both non-trading
days, found while cross-checking the Journal tab against
TARGET_ACTION_DATES_DETAIL_thru_JAN_2027.docx. Moved to the next
trading day each (9/8, 11/9), keeping the existing ~7-day-after-
month-end spacing. Updated in both the workbook Journal tab (with an
explanatory note) and the docx, which stay in sync.

Co-Authored-By: Claude Sonnet 5 <noreply@anthropic.com>
</commit_message>
<xml_diff>
--- a/TARGET_ACTION_DATES_DETAIL_thru_JAN_2027.docx
+++ b/TARGET_ACTION_DATES_DETAIL_thru_JAN_2027.docx
@@ -176,7 +176,7 @@
                 <w:sz w:val="18"/>
                 <w:szCs w:val="18"/>
               </w:rPr>
-              <w:t>09/07/2026</w:t>
+              <w:t>09/08/2026</w:t>
             </w:r>
           </w:p>
         </w:tc>
@@ -1880,8 +1880,7 @@
                 <w:sz w:val="18"/>
                 <w:szCs w:val="18"/>
               </w:rPr>
-              <w:lastRenderedPageBreak/>
-              <w:t>11/07/2026</w:t>
+              <w:t>11/09/2026</w:t>
             </w:r>
           </w:p>
         </w:tc>

</xml_diff>